<commit_message>
feat: DenseNet-121 training completion, metrics generation, and documentation update
</commit_message>
<xml_diff>
--- a/Pneumonia_Detection_Research_Report.docx
+++ b/Pneumonia_Detection_Research_Report.docx
@@ -3948,7 +3948,7 @@
               <w:rPr>
                 <w:sz w:val="20"/>
               </w:rPr>
-              <w:t>0.2214</w:t>
+              <w:t>0.2171</w:t>
             </w:r>
           </w:p>
         </w:tc>
@@ -3972,7 +3972,7 @@
               <w:rPr>
                 <w:sz w:val="20"/>
               </w:rPr>
-              <w:t>0.9180</w:t>
+              <w:t>0.9140</w:t>
             </w:r>
           </w:p>
         </w:tc>
@@ -3996,7 +3996,7 @@
               <w:rPr>
                 <w:sz w:val="20"/>
               </w:rPr>
-              <w:t>0.2636</w:t>
+              <w:t>0.2189</w:t>
             </w:r>
           </w:p>
         </w:tc>
@@ -4020,7 +4020,7 @@
               <w:rPr>
                 <w:sz w:val="20"/>
               </w:rPr>
-              <w:t>0.9147</w:t>
+              <w:t>0.9189</w:t>
             </w:r>
           </w:p>
         </w:tc>
@@ -4044,7 +4044,7 @@
               <w:rPr>
                 <w:sz w:val="20"/>
               </w:rPr>
-              <w:t>0.9003</w:t>
+              <w:t>0.9715</w:t>
             </w:r>
           </w:p>
         </w:tc>
@@ -4068,7 +4068,7 @@
               <w:rPr>
                 <w:sz w:val="20"/>
               </w:rPr>
-              <w:t>0.9930</w:t>
+              <w:t>0.9158</w:t>
             </w:r>
           </w:p>
         </w:tc>
@@ -4092,7 +4092,7 @@
               <w:rPr>
                 <w:sz w:val="20"/>
               </w:rPr>
-              <w:t>0.9444</w:t>
+              <w:t>0.9428</w:t>
             </w:r>
           </w:p>
         </w:tc>
@@ -4140,7 +4140,7 @@
               <w:rPr>
                 <w:sz w:val="20"/>
               </w:rPr>
-              <w:t>0.1512</w:t>
+              <w:t>0.1538</w:t>
             </w:r>
           </w:p>
         </w:tc>
@@ -4163,7 +4163,7 @@
               <w:rPr>
                 <w:sz w:val="20"/>
               </w:rPr>
-              <w:t>0.9441</w:t>
+              <w:t>0.9407</w:t>
             </w:r>
           </w:p>
         </w:tc>
@@ -4186,7 +4186,7 @@
               <w:rPr>
                 <w:sz w:val="20"/>
               </w:rPr>
-              <w:t>0.2191</w:t>
+              <w:t>0.7968</w:t>
             </w:r>
           </w:p>
         </w:tc>
@@ -4209,7 +4209,7 @@
               <w:rPr>
                 <w:sz w:val="20"/>
               </w:rPr>
-              <w:t>0.9206</w:t>
+              <w:t>0.8242</w:t>
             </w:r>
           </w:p>
         </w:tc>
@@ -4232,7 +4232,7 @@
               <w:rPr>
                 <w:sz w:val="20"/>
               </w:rPr>
-              <w:t>0.9215</w:t>
+              <w:t>0.9985</w:t>
             </w:r>
           </w:p>
         </w:tc>
@@ -4255,7 +4255,7 @@
               <w:rPr>
                 <w:sz w:val="20"/>
               </w:rPr>
-              <w:t>0.9743</w:t>
+              <w:t>0.7602</w:t>
             </w:r>
           </w:p>
         </w:tc>
@@ -4278,7 +4278,7 @@
               <w:rPr>
                 <w:sz w:val="20"/>
               </w:rPr>
-              <w:t>0.9471</w:t>
+              <w:t>0.8632</w:t>
             </w:r>
           </w:p>
         </w:tc>
@@ -4328,7 +4328,7 @@
               <w:rPr>
                 <w:sz w:val="20"/>
               </w:rPr>
-              <w:t>0.1354</w:t>
+              <w:t>0.1409</w:t>
             </w:r>
           </w:p>
         </w:tc>
@@ -4352,7 +4352,7 @@
               <w:rPr>
                 <w:sz w:val="20"/>
               </w:rPr>
-              <w:t>0.9497</w:t>
+              <w:t>0.9503</w:t>
             </w:r>
           </w:p>
         </w:tc>
@@ -4376,7 +4376,7 @@
               <w:rPr>
                 <w:sz w:val="20"/>
               </w:rPr>
-              <w:t>0.1833</w:t>
+              <w:t>0.3849</w:t>
             </w:r>
           </w:p>
         </w:tc>
@@ -4400,7 +4400,7 @@
               <w:rPr>
                 <w:sz w:val="20"/>
               </w:rPr>
-              <w:t>0.9266</w:t>
+              <w:t>0.8643</w:t>
             </w:r>
           </w:p>
         </w:tc>
@@ -4424,7 +4424,7 @@
               <w:rPr>
                 <w:sz w:val="20"/>
               </w:rPr>
-              <w:t>0.9184</w:t>
+              <w:t>0.8432</w:t>
             </w:r>
           </w:p>
         </w:tc>
@@ -4448,7 +4448,7 @@
               <w:rPr>
                 <w:sz w:val="20"/>
               </w:rPr>
-              <w:t>0.9871</w:t>
+              <w:t>1.0000</w:t>
             </w:r>
           </w:p>
         </w:tc>
@@ -4472,7 +4472,7 @@
               <w:rPr>
                 <w:sz w:val="20"/>
               </w:rPr>
-              <w:t>0.9515</w:t>
+              <w:t>0.9149</w:t>
             </w:r>
           </w:p>
         </w:tc>
@@ -4520,7 +4520,7 @@
               <w:rPr>
                 <w:sz w:val="20"/>
               </w:rPr>
-              <w:t>0.1348</w:t>
+              <w:t>0.1234</w:t>
             </w:r>
           </w:p>
         </w:tc>
@@ -4543,7 +4543,7 @@
               <w:rPr>
                 <w:sz w:val="20"/>
               </w:rPr>
-              <w:t>0.9544</w:t>
+              <w:t>0.9557</w:t>
             </w:r>
           </w:p>
         </w:tc>
@@ -4566,7 +4566,7 @@
               <w:rPr>
                 <w:sz w:val="20"/>
               </w:rPr>
-              <w:t>0.2291</w:t>
+              <w:t>0.1292</w:t>
             </w:r>
           </w:p>
         </w:tc>
@@ -4589,7 +4589,7 @@
               <w:rPr>
                 <w:sz w:val="20"/>
               </w:rPr>
-              <w:t>0.9224</w:t>
+              <w:t>0.9514</w:t>
             </w:r>
           </w:p>
         </w:tc>
@@ -4612,7 +4612,7 @@
               <w:rPr>
                 <w:sz w:val="20"/>
               </w:rPr>
-              <w:t>0.9494</w:t>
+              <w:t>0.9650</w:t>
             </w:r>
           </w:p>
         </w:tc>
@@ -4635,7 +4635,7 @@
               <w:rPr>
                 <w:sz w:val="20"/>
               </w:rPr>
-              <w:t>0.9439</w:t>
+              <w:t>0.9684</w:t>
             </w:r>
           </w:p>
         </w:tc>
@@ -4658,7 +4658,7 @@
               <w:rPr>
                 <w:sz w:val="20"/>
               </w:rPr>
-              <w:t>0.9466</w:t>
+              <w:t>0.9667</w:t>
             </w:r>
           </w:p>
         </w:tc>
@@ -4708,7 +4708,7 @@
               <w:rPr>
                 <w:sz w:val="20"/>
               </w:rPr>
-              <w:t>0.1174</w:t>
+              <w:t>0.1117</w:t>
             </w:r>
           </w:p>
         </w:tc>
@@ -4732,7 +4732,7 @@
               <w:rPr>
                 <w:sz w:val="20"/>
               </w:rPr>
-              <w:t>0.9557</w:t>
+              <w:t>0.9589</w:t>
             </w:r>
           </w:p>
         </w:tc>
@@ -4756,7 +4756,7 @@
               <w:rPr>
                 <w:sz w:val="20"/>
               </w:rPr>
-              <w:t>0.1731</w:t>
+              <w:t>0.1177</w:t>
             </w:r>
           </w:p>
         </w:tc>
@@ -4780,7 +4780,7 @@
               <w:rPr>
                 <w:sz w:val="20"/>
               </w:rPr>
-              <w:t>0.9369</w:t>
+              <w:t>0.9522</w:t>
             </w:r>
           </w:p>
         </w:tc>
@@ -4804,7 +4804,7 @@
               <w:rPr>
                 <w:sz w:val="20"/>
               </w:rPr>
-              <w:t>0.9677</w:t>
+              <w:t>0.9566</w:t>
             </w:r>
           </w:p>
         </w:tc>
@@ -4828,7 +4828,7 @@
               <w:rPr>
                 <w:sz w:val="20"/>
               </w:rPr>
-              <w:t>0.9450</w:t>
+              <w:t>0.9789</w:t>
             </w:r>
           </w:p>
         </w:tc>
@@ -4852,7 +4852,7 @@
               <w:rPr>
                 <w:sz w:val="20"/>
               </w:rPr>
-              <w:t>0.9562</w:t>
+              <w:t>0.9676</w:t>
             </w:r>
           </w:p>
         </w:tc>
@@ -4900,7 +4900,7 @@
               <w:rPr>
                 <w:sz w:val="20"/>
               </w:rPr>
-              <w:t>0.1178</w:t>
+              <w:t>0.1128</w:t>
             </w:r>
           </w:p>
         </w:tc>
@@ -4923,7 +4923,7 @@
               <w:rPr>
                 <w:sz w:val="20"/>
               </w:rPr>
-              <w:t>0.9553</w:t>
+              <w:t>0.9583</w:t>
             </w:r>
           </w:p>
         </w:tc>
@@ -4946,7 +4946,7 @@
               <w:rPr>
                 <w:sz w:val="20"/>
               </w:rPr>
-              <w:t>0.1256</w:t>
+              <w:t>0.1885</w:t>
             </w:r>
           </w:p>
         </w:tc>
@@ -4969,7 +4969,7 @@
               <w:rPr>
                 <w:sz w:val="20"/>
               </w:rPr>
-              <w:t>0.9505</w:t>
+              <w:t>0.9326</w:t>
             </w:r>
           </w:p>
         </w:tc>
@@ -4992,7 +4992,7 @@
               <w:rPr>
                 <w:sz w:val="20"/>
               </w:rPr>
-              <w:t>0.9628</w:t>
+              <w:t>0.9172</w:t>
             </w:r>
           </w:p>
         </w:tc>
@@ -5015,7 +5015,7 @@
               <w:rPr>
                 <w:sz w:val="20"/>
               </w:rPr>
-              <w:t>0.9696</w:t>
+              <w:t>0.9977</w:t>
             </w:r>
           </w:p>
         </w:tc>
@@ -5038,7 +5038,7 @@
               <w:rPr>
                 <w:sz w:val="20"/>
               </w:rPr>
-              <w:t>0.9662</w:t>
+              <w:t>0.9557</w:t>
             </w:r>
           </w:p>
         </w:tc>
@@ -5088,7 +5088,7 @@
               <w:rPr>
                 <w:sz w:val="20"/>
               </w:rPr>
-              <w:t>0.1184</w:t>
+              <w:t>0.1060</w:t>
             </w:r>
           </w:p>
         </w:tc>
@@ -5112,7 +5112,7 @@
               <w:rPr>
                 <w:sz w:val="20"/>
               </w:rPr>
-              <w:t>0.9551</w:t>
+              <w:t>0.9621</w:t>
             </w:r>
           </w:p>
         </w:tc>
@@ -5136,7 +5136,7 @@
               <w:rPr>
                 <w:sz w:val="20"/>
               </w:rPr>
-              <w:t>0.4345</w:t>
+              <w:t>0.2691</w:t>
             </w:r>
           </w:p>
         </w:tc>
@@ -5160,7 +5160,7 @@
               <w:rPr>
                 <w:sz w:val="20"/>
               </w:rPr>
-              <w:t>0.8609</w:t>
+              <w:t>0.9104</w:t>
             </w:r>
           </w:p>
         </w:tc>
@@ -5184,7 +5184,7 @@
               <w:rPr>
                 <w:sz w:val="20"/>
               </w:rPr>
-              <w:t>0.8426</w:t>
+              <w:t>0.8931</w:t>
             </w:r>
           </w:p>
         </w:tc>
@@ -5208,7 +5208,7 @@
               <w:rPr>
                 <w:sz w:val="20"/>
               </w:rPr>
-              <w:t>0.9953</w:t>
+              <w:t>0.9965</w:t>
             </w:r>
           </w:p>
         </w:tc>
@@ -5232,7 +5232,7 @@
               <w:rPr>
                 <w:sz w:val="20"/>
               </w:rPr>
-              <w:t>0.9126</w:t>
+              <w:t>0.9420</w:t>
             </w:r>
           </w:p>
         </w:tc>
@@ -5280,7 +5280,7 @@
               <w:rPr>
                 <w:sz w:val="20"/>
               </w:rPr>
-              <w:t>0.1066</w:t>
+              <w:t>0.1020</w:t>
             </w:r>
           </w:p>
         </w:tc>
@@ -5303,7 +5303,7 @@
               <w:rPr>
                 <w:sz w:val="20"/>
               </w:rPr>
-              <w:t>0.9623</w:t>
+              <w:t>0.9679</w:t>
             </w:r>
           </w:p>
         </w:tc>
@@ -5326,7 +5326,7 @@
               <w:rPr>
                 <w:sz w:val="20"/>
               </w:rPr>
-              <w:t>0.1419</w:t>
+              <w:t>0.3441</w:t>
             </w:r>
           </w:p>
         </w:tc>
@@ -5349,7 +5349,7 @@
               <w:rPr>
                 <w:sz w:val="20"/>
               </w:rPr>
-              <w:t>0.9514</w:t>
+              <w:t>0.8788</w:t>
             </w:r>
           </w:p>
         </w:tc>
@@ -5372,7 +5372,7 @@
               <w:rPr>
                 <w:sz w:val="20"/>
               </w:rPr>
-              <w:t>0.9544</w:t>
+              <w:t>0.8576</w:t>
             </w:r>
           </w:p>
         </w:tc>
@@ -5395,7 +5395,7 @@
               <w:rPr>
                 <w:sz w:val="20"/>
               </w:rPr>
-              <w:t>0.9801</w:t>
+              <w:t>1.0000</w:t>
             </w:r>
           </w:p>
         </w:tc>
@@ -5418,7 +5418,7 @@
               <w:rPr>
                 <w:sz w:val="20"/>
               </w:rPr>
-              <w:t>0.9671</w:t>
+              <w:t>0.9233</w:t>
             </w:r>
           </w:p>
         </w:tc>
@@ -5468,7 +5468,7 @@
               <w:rPr>
                 <w:sz w:val="20"/>
               </w:rPr>
-              <w:t>0.1053</w:t>
+              <w:t>0.1119</w:t>
             </w:r>
           </w:p>
         </w:tc>
@@ -5492,7 +5492,7 @@
               <w:rPr>
                 <w:sz w:val="20"/>
               </w:rPr>
-              <w:t>0.9610</w:t>
+              <w:t>0.9578</w:t>
             </w:r>
           </w:p>
         </w:tc>
@@ -5516,7 +5516,7 @@
               <w:rPr>
                 <w:sz w:val="20"/>
               </w:rPr>
-              <w:t>0.1262</w:t>
+              <w:t>0.1407</w:t>
             </w:r>
           </w:p>
         </w:tc>
@@ -5540,7 +5540,7 @@
               <w:rPr>
                 <w:sz w:val="20"/>
               </w:rPr>
-              <w:t>0.9548</w:t>
+              <w:t>0.9488</w:t>
             </w:r>
           </w:p>
         </w:tc>
@@ -5564,7 +5564,7 @@
               <w:rPr>
                 <w:sz w:val="20"/>
               </w:rPr>
-              <w:t>0.9536</w:t>
+              <w:t>0.9522</w:t>
             </w:r>
           </w:p>
         </w:tc>
@@ -5588,7 +5588,7 @@
               <w:rPr>
                 <w:sz w:val="20"/>
               </w:rPr>
-              <w:t>0.9860</w:t>
+              <w:t>0.9789</w:t>
             </w:r>
           </w:p>
         </w:tc>
@@ -5612,7 +5612,7 @@
               <w:rPr>
                 <w:sz w:val="20"/>
               </w:rPr>
-              <w:t>0.9695</w:t>
+              <w:t>0.9654</w:t>
             </w:r>
           </w:p>
         </w:tc>
@@ -5660,7 +5660,7 @@
               <w:rPr>
                 <w:sz w:val="20"/>
               </w:rPr>
-              <w:t>0.1011</w:t>
+              <w:t>0.0816</w:t>
             </w:r>
           </w:p>
         </w:tc>
@@ -5683,7 +5683,7 @@
               <w:rPr>
                 <w:sz w:val="20"/>
               </w:rPr>
-              <w:t>0.9645</w:t>
+              <w:t>0.9692</w:t>
             </w:r>
           </w:p>
         </w:tc>
@@ -5706,7 +5706,7 @@
               <w:rPr>
                 <w:sz w:val="20"/>
               </w:rPr>
-              <w:t>0.2921</w:t>
+              <w:t>0.1358</w:t>
             </w:r>
           </w:p>
         </w:tc>
@@ -5729,7 +5729,7 @@
               <w:rPr>
                 <w:sz w:val="20"/>
               </w:rPr>
-              <w:t>0.9096</w:t>
+              <w:t>0.9445</w:t>
             </w:r>
           </w:p>
         </w:tc>
@@ -5752,7 +5752,7 @@
               <w:rPr>
                 <w:sz w:val="20"/>
               </w:rPr>
-              <w:t>0.8930</w:t>
+              <w:t>0.9312</w:t>
             </w:r>
           </w:p>
         </w:tc>
@@ -5775,7 +5775,7 @@
               <w:rPr>
                 <w:sz w:val="20"/>
               </w:rPr>
-              <w:t>0.9953</w:t>
+              <w:t>0.9977</w:t>
             </w:r>
           </w:p>
         </w:tc>
@@ -5798,201 +5798,7 @@
               <w:rPr>
                 <w:sz w:val="20"/>
               </w:rPr>
-              <w:t>0.9414</w:t>
-            </w:r>
-          </w:p>
-        </w:tc>
-      </w:tr>
-      <w:tr>
-        <w:tc>
-          <w:tcPr>
-            <w:tcW w:type="dxa" w:w="1140"/>
-            <w:shd w:val="clear" w:color="auto" w:fill="F0F4F8"/>
-            <w:tcBorders>
-              <w:top w:val="single" w:sz="4" w:space="0" w:color="2E4057"/>
-              <w:left w:val="single" w:sz="4" w:space="0" w:color="2E4057"/>
-              <w:bottom w:val="single" w:sz="4" w:space="0" w:color="2E4057"/>
-              <w:right w:val="single" w:sz="4" w:space="0" w:color="2E4057"/>
-            </w:tcBorders>
-          </w:tcPr>
-          <w:p>
-            <w:pPr>
-              <w:jc w:val="center"/>
-            </w:pPr>
-            <w:r/>
-            <w:r>
-              <w:rPr>
-                <w:sz w:val="20"/>
-              </w:rPr>
-              <w:t>11</w:t>
-            </w:r>
-          </w:p>
-        </w:tc>
-        <w:tc>
-          <w:tcPr>
-            <w:tcW w:type="dxa" w:w="1140"/>
-            <w:shd w:val="clear" w:color="auto" w:fill="F0F4F8"/>
-            <w:tcBorders>
-              <w:top w:val="single" w:sz="4" w:space="0" w:color="2E4057"/>
-              <w:left w:val="single" w:sz="4" w:space="0" w:color="2E4057"/>
-              <w:bottom w:val="single" w:sz="4" w:space="0" w:color="2E4057"/>
-              <w:right w:val="single" w:sz="4" w:space="0" w:color="2E4057"/>
-            </w:tcBorders>
-          </w:tcPr>
-          <w:p>
-            <w:pPr>
-              <w:jc w:val="center"/>
-            </w:pPr>
-            <w:r/>
-            <w:r>
-              <w:rPr>
-                <w:sz w:val="20"/>
-              </w:rPr>
-              <w:t>0.0787</w:t>
-            </w:r>
-          </w:p>
-        </w:tc>
-        <w:tc>
-          <w:tcPr>
-            <w:tcW w:type="dxa" w:w="1140"/>
-            <w:shd w:val="clear" w:color="auto" w:fill="F0F4F8"/>
-            <w:tcBorders>
-              <w:top w:val="single" w:sz="4" w:space="0" w:color="2E4057"/>
-              <w:left w:val="single" w:sz="4" w:space="0" w:color="2E4057"/>
-              <w:bottom w:val="single" w:sz="4" w:space="0" w:color="2E4057"/>
-              <w:right w:val="single" w:sz="4" w:space="0" w:color="2E4057"/>
-            </w:tcBorders>
-          </w:tcPr>
-          <w:p>
-            <w:pPr>
-              <w:jc w:val="center"/>
-            </w:pPr>
-            <w:r/>
-            <w:r>
-              <w:rPr>
-                <w:sz w:val="20"/>
-              </w:rPr>
-              <w:t>0.9709</w:t>
-            </w:r>
-          </w:p>
-        </w:tc>
-        <w:tc>
-          <w:tcPr>
-            <w:tcW w:type="dxa" w:w="1140"/>
-            <w:shd w:val="clear" w:color="auto" w:fill="F0F4F8"/>
-            <w:tcBorders>
-              <w:top w:val="single" w:sz="4" w:space="0" w:color="2E4057"/>
-              <w:left w:val="single" w:sz="4" w:space="0" w:color="2E4057"/>
-              <w:bottom w:val="single" w:sz="4" w:space="0" w:color="2E4057"/>
-              <w:right w:val="single" w:sz="4" w:space="0" w:color="2E4057"/>
-            </w:tcBorders>
-          </w:tcPr>
-          <w:p>
-            <w:pPr>
-              <w:jc w:val="center"/>
-            </w:pPr>
-            <w:r/>
-            <w:r>
-              <w:rPr>
-                <w:sz w:val="20"/>
-              </w:rPr>
-              <w:t>0.1766</w:t>
-            </w:r>
-          </w:p>
-        </w:tc>
-        <w:tc>
-          <w:tcPr>
-            <w:tcW w:type="dxa" w:w="1140"/>
-            <w:shd w:val="clear" w:color="auto" w:fill="F0F4F8"/>
-            <w:tcBorders>
-              <w:top w:val="single" w:sz="4" w:space="0" w:color="2E4057"/>
-              <w:left w:val="single" w:sz="4" w:space="0" w:color="2E4057"/>
-              <w:bottom w:val="single" w:sz="4" w:space="0" w:color="2E4057"/>
-              <w:right w:val="single" w:sz="4" w:space="0" w:color="2E4057"/>
-            </w:tcBorders>
-          </w:tcPr>
-          <w:p>
-            <w:pPr>
-              <w:jc w:val="center"/>
-            </w:pPr>
-            <w:r/>
-            <w:r>
-              <w:rPr>
-                <w:sz w:val="20"/>
-              </w:rPr>
-              <w:t>0.9411</w:t>
-            </w:r>
-          </w:p>
-        </w:tc>
-        <w:tc>
-          <w:tcPr>
-            <w:tcW w:type="dxa" w:w="1140"/>
-            <w:shd w:val="clear" w:color="auto" w:fill="F0F4F8"/>
-            <w:tcBorders>
-              <w:top w:val="single" w:sz="4" w:space="0" w:color="2E4057"/>
-              <w:left w:val="single" w:sz="4" w:space="0" w:color="2E4057"/>
-              <w:bottom w:val="single" w:sz="4" w:space="0" w:color="2E4057"/>
-              <w:right w:val="single" w:sz="4" w:space="0" w:color="2E4057"/>
-            </w:tcBorders>
-          </w:tcPr>
-          <w:p>
-            <w:pPr>
-              <w:jc w:val="center"/>
-            </w:pPr>
-            <w:r/>
-            <w:r>
-              <w:rPr>
-                <w:sz w:val="20"/>
-              </w:rPr>
-              <w:t>0.9281</w:t>
-            </w:r>
-          </w:p>
-        </w:tc>
-        <w:tc>
-          <w:tcPr>
-            <w:tcW w:type="dxa" w:w="1140"/>
-            <w:shd w:val="clear" w:color="auto" w:fill="F0F4F8"/>
-            <w:tcBorders>
-              <w:top w:val="single" w:sz="4" w:space="0" w:color="2E4057"/>
-              <w:left w:val="single" w:sz="4" w:space="0" w:color="2E4057"/>
-              <w:bottom w:val="single" w:sz="4" w:space="0" w:color="2E4057"/>
-              <w:right w:val="single" w:sz="4" w:space="0" w:color="2E4057"/>
-            </w:tcBorders>
-          </w:tcPr>
-          <w:p>
-            <w:pPr>
-              <w:jc w:val="center"/>
-            </w:pPr>
-            <w:r/>
-            <w:r>
-              <w:rPr>
-                <w:sz w:val="20"/>
-              </w:rPr>
-              <w:t>0.9965</w:t>
-            </w:r>
-          </w:p>
-        </w:tc>
-        <w:tc>
-          <w:tcPr>
-            <w:tcW w:type="dxa" w:w="1140"/>
-            <w:shd w:val="clear" w:color="auto" w:fill="F0F4F8"/>
-            <w:tcBorders>
-              <w:top w:val="single" w:sz="4" w:space="0" w:color="2E4057"/>
-              <w:left w:val="single" w:sz="4" w:space="0" w:color="2E4057"/>
-              <w:bottom w:val="single" w:sz="4" w:space="0" w:color="2E4057"/>
-              <w:right w:val="single" w:sz="4" w:space="0" w:color="2E4057"/>
-            </w:tcBorders>
-          </w:tcPr>
-          <w:p>
-            <w:pPr>
-              <w:jc w:val="center"/>
-            </w:pPr>
-            <w:r/>
-            <w:r>
-              <w:rPr>
-                <w:sz w:val="20"/>
-              </w:rPr>
-              <w:t>0.9611</w:t>
+              <w:t>0.9633</w:t>
             </w:r>
           </w:p>
         </w:tc>

</xml_diff>